<commit_message>
added milestone 1 pdf files and updated
</commit_message>
<xml_diff>
--- a/docs/proposal/Proposal.docx
+++ b/docs/proposal/Proposal.docx
@@ -5267,6 +5267,170 @@
           <w:lang w:val="en-US"/>
         </w:rPr>
         <w:t xml:space="preserve"> React.js is the most popular js framework and is widely used throughout the world of Software Engineering. Getting hands on experience with React know will set us up with better industry experience in the future.</w:t>
+      </w:r>
+    </w:p>
+    <w:p>
+      <w:pPr>
+        <w:pStyle w:val="ListParagraph"/>
+        <w:numPr>
+          <w:ilvl w:val="0"/>
+          <w:numId w:val="1"/>
+        </w:numPr>
+        <w:rPr>
+          <w:rFonts w:ascii="DIN Condensed" w:hAnsi="DIN Condensed" w:cs="Times New Roman"/>
+          <w:sz w:val="32"/>
+          <w:szCs w:val="32"/>
+          <w:lang w:val="en-US"/>
+        </w:rPr>
+      </w:pPr>
+      <w:r>
+        <w:rPr>
+          <w:rFonts w:ascii="DIN Condensed" w:hAnsi="DIN Condensed" w:cs="Times New Roman"/>
+          <w:sz w:val="32"/>
+          <w:szCs w:val="32"/>
+          <w:lang w:val="en-US"/>
+        </w:rPr>
+        <w:t>CSS framework: Tailwind</w:t>
+      </w:r>
+    </w:p>
+    <w:p>
+      <w:pPr>
+        <w:pStyle w:val="ListParagraph"/>
+        <w:numPr>
+          <w:ilvl w:val="1"/>
+          <w:numId w:val="1"/>
+        </w:numPr>
+        <w:rPr>
+          <w:rFonts w:ascii="DIN Condensed" w:hAnsi="DIN Condensed" w:cs="Times New Roman"/>
+          <w:sz w:val="32"/>
+          <w:szCs w:val="32"/>
+          <w:lang w:val="en-US"/>
+        </w:rPr>
+      </w:pPr>
+      <w:r>
+        <w:rPr>
+          <w:rFonts w:cs="Times New Roman"/>
+          <w:lang w:val="en-US"/>
+        </w:rPr>
+        <w:t>Why</w:t>
+      </w:r>
+      <w:r>
+        <w:rPr>
+          <w:rFonts w:cs="Times New Roman"/>
+          <w:lang w:val="en-US"/>
+        </w:rPr>
+        <w:t xml:space="preserve">? Tailwind </w:t>
+      </w:r>
+      <w:r>
+        <w:rPr>
+          <w:rFonts w:cs="Times New Roman"/>
+          <w:lang w:val="en-US"/>
+        </w:rPr>
+        <w:t>CSS</w:t>
+      </w:r>
+      <w:r>
+        <w:rPr>
+          <w:rFonts w:cs="Times New Roman"/>
+          <w:lang w:val="en-US"/>
+        </w:rPr>
+        <w:t xml:space="preserve"> is a very popular </w:t>
+      </w:r>
+      <w:r>
+        <w:rPr>
+          <w:rFonts w:cs="Times New Roman"/>
+          <w:lang w:val="en-US"/>
+        </w:rPr>
+        <w:t>CSS</w:t>
+      </w:r>
+      <w:r>
+        <w:rPr>
+          <w:rFonts w:cs="Times New Roman"/>
+          <w:lang w:val="en-US"/>
+        </w:rPr>
+        <w:t xml:space="preserve"> framework and </w:t>
+      </w:r>
+      <w:proofErr w:type="gramStart"/>
+      <w:r>
+        <w:rPr>
+          <w:rFonts w:cs="Times New Roman"/>
+          <w:lang w:val="en-US"/>
+        </w:rPr>
+        <w:t>React</w:t>
+      </w:r>
+      <w:proofErr w:type="gramEnd"/>
+      <w:r>
+        <w:rPr>
+          <w:rFonts w:cs="Times New Roman"/>
+          <w:lang w:val="en-US"/>
+        </w:rPr>
+        <w:t xml:space="preserve"> and </w:t>
+      </w:r>
+      <w:r>
+        <w:rPr>
+          <w:rFonts w:cs="Times New Roman"/>
+          <w:lang w:val="en-US"/>
+        </w:rPr>
+        <w:t>tailwind</w:t>
+      </w:r>
+      <w:r>
+        <w:rPr>
+          <w:rFonts w:cs="Times New Roman"/>
+          <w:lang w:val="en-US"/>
+        </w:rPr>
+        <w:t xml:space="preserve"> </w:t>
+      </w:r>
+      <w:r>
+        <w:rPr>
+          <w:rFonts w:cs="Times New Roman"/>
+          <w:lang w:val="en-US"/>
+        </w:rPr>
+        <w:t>usually</w:t>
+      </w:r>
+      <w:r>
+        <w:rPr>
+          <w:rFonts w:cs="Times New Roman"/>
+          <w:lang w:val="en-US"/>
+        </w:rPr>
+        <w:t xml:space="preserve"> go hand in hand.</w:t>
+      </w:r>
+      <w:r>
+        <w:rPr>
+          <w:rFonts w:cs="Times New Roman"/>
+          <w:lang w:val="en-US"/>
+        </w:rPr>
+        <w:t xml:space="preserve"> And </w:t>
+      </w:r>
+      <w:proofErr w:type="gramStart"/>
+      <w:r>
+        <w:rPr>
+          <w:rFonts w:cs="Times New Roman"/>
+          <w:lang w:val="en-US"/>
+        </w:rPr>
+        <w:t>also</w:t>
+      </w:r>
+      <w:proofErr w:type="gramEnd"/>
+      <w:r>
+        <w:rPr>
+          <w:rFonts w:cs="Times New Roman"/>
+          <w:lang w:val="en-US"/>
+        </w:rPr>
+        <w:t xml:space="preserve"> tailwind works great with </w:t>
+      </w:r>
+      <w:proofErr w:type="spellStart"/>
+      <w:r>
+        <w:rPr>
+          <w:rFonts w:cs="Times New Roman"/>
+          <w:lang w:val="en-US"/>
+        </w:rPr>
+        <w:t>jsx</w:t>
+      </w:r>
+      <w:proofErr w:type="spellEnd"/>
+      <w:r>
+        <w:rPr>
+          <w:rFonts w:cs="Times New Roman"/>
+          <w:lang w:val="en-US"/>
+        </w:rPr>
+        <w:t>.</w:t>
       </w:r>
     </w:p>
     <w:sectPr>

</xml_diff>